<commit_message>
docs: add report diagrams and tidy fonts and list indentation
Drew the five figures the report references — high-level architecture,
restaurant-service class diagram (JPA JOINED inheritance), order state
machine, the cross-database ER diagram, and the Docker Compose deployment
topology — and embedded each above its caption. Also made Times New Roman
the document-wide font so the cover, headings and body are consistent, and
gave the bullet lists a hanging indent so wrapped lines align under the text.
</commit_message>
<xml_diff>
--- a/docs/Foodly_Project_Report.docx
+++ b/docs/Foodly_Project_Report.docx
@@ -5382,7 +5382,7 @@
     <w:p>
       <w:pPr>
         <w:spacing w:line="240" w:lineRule="auto" w:after="40"/>
-        <w:ind w:left="432"/>
+        <w:ind w:left="720" w:hanging="288"/>
         <w:jc w:val="left"/>
       </w:pPr>
       <w:r>
@@ -5396,7 +5396,7 @@
     <w:p>
       <w:pPr>
         <w:spacing w:line="240" w:lineRule="auto" w:after="40"/>
-        <w:ind w:left="432"/>
+        <w:ind w:left="720" w:hanging="288"/>
         <w:jc w:val="left"/>
       </w:pPr>
       <w:r>
@@ -5410,7 +5410,7 @@
     <w:p>
       <w:pPr>
         <w:spacing w:line="240" w:lineRule="auto" w:after="40"/>
-        <w:ind w:left="432"/>
+        <w:ind w:left="720" w:hanging="288"/>
         <w:jc w:val="left"/>
       </w:pPr>
       <w:r>
@@ -5424,7 +5424,7 @@
     <w:p>
       <w:pPr>
         <w:spacing w:line="240" w:lineRule="auto" w:after="40"/>
-        <w:ind w:left="432"/>
+        <w:ind w:left="720" w:hanging="288"/>
         <w:jc w:val="left"/>
       </w:pPr>
       <w:r>
@@ -5438,7 +5438,7 @@
     <w:p>
       <w:pPr>
         <w:spacing w:line="240" w:lineRule="auto" w:after="40"/>
-        <w:ind w:left="432"/>
+        <w:ind w:left="720" w:hanging="288"/>
         <w:jc w:val="left"/>
       </w:pPr>
       <w:r>
@@ -5452,7 +5452,7 @@
     <w:p>
       <w:pPr>
         <w:spacing w:line="240" w:lineRule="auto" w:after="40"/>
-        <w:ind w:left="432"/>
+        <w:ind w:left="720" w:hanging="288"/>
         <w:jc w:val="left"/>
       </w:pPr>
       <w:r>
@@ -5466,7 +5466,7 @@
     <w:p>
       <w:pPr>
         <w:spacing w:line="240" w:lineRule="auto" w:after="40"/>
-        <w:ind w:left="432"/>
+        <w:ind w:left="720" w:hanging="288"/>
         <w:jc w:val="left"/>
       </w:pPr>
       <w:r>
@@ -5492,6 +5492,46 @@
     </w:p>
     <w:p>
       <w:pPr>
+        <w:spacing w:before="120" w:after="40"/>
+        <w:jc w:val="center"/>
+      </w:pPr>
+      <w:r>
+        <w:drawing>
+          <wp:inline>
+            <wp:extent cx="5486400" cy="3722513"/>
+            <wp:docPr id="3" name="Picture 3"/>
+            <wp:cNvGraphicFramePr>
+              <a:graphicFrameLocks noChangeAspect="1"/>
+            </wp:cNvGraphicFramePr>
+            <a:graphic>
+              <a:graphicData uri="http://schemas.openxmlformats.org/drawingml/2006/picture">
+                <pic:pic>
+                  <pic:nvPicPr>
+                    <pic:cNvPr id="0" name="fig_1_1_architecture.png"/>
+                    <pic:cNvPicPr/>
+                  </pic:nvPicPr>
+                  <pic:blipFill>
+                    <a:blip r:embed="rId13"/>
+                    <a:stretch>
+                      <a:fillRect/>
+                    </a:stretch>
+                  </pic:blipFill>
+                  <pic:spPr>
+                    <a:xfrm>
+                      <a:off x="0" y="0"/>
+                      <a:ext cx="5486400" cy="3722513"/>
+                    </a:xfrm>
+                    <a:prstGeom prst="rect"/>
+                  </pic:spPr>
+                </pic:pic>
+              </a:graphicData>
+            </a:graphic>
+          </wp:inline>
+        </w:drawing>
+      </w:r>
+    </w:p>
+    <w:p>
+      <w:pPr>
         <w:spacing w:line="240" w:lineRule="auto" w:after="240"/>
         <w:jc w:val="center"/>
       </w:pPr>
@@ -5501,7 +5541,7 @@
           <w:i/>
           <w:sz w:val="22"/>
         </w:rPr>
-        <w:t>Figure 1.1: Foodly high-level system architecture (see drawio source in /docs/architecture.drawio).</w:t>
+        <w:t>Figure 1.1: Foodly high-level system architecture.</w:t>
       </w:r>
     </w:p>
     <w:p>
@@ -5550,7 +5590,7 @@
     <w:p>
       <w:pPr>
         <w:spacing w:line="240" w:lineRule="auto" w:after="40"/>
-        <w:ind w:left="432"/>
+        <w:ind w:left="720" w:hanging="288"/>
         <w:jc w:val="left"/>
       </w:pPr>
       <w:r>
@@ -5564,7 +5604,7 @@
     <w:p>
       <w:pPr>
         <w:spacing w:line="240" w:lineRule="auto" w:after="40"/>
-        <w:ind w:left="432"/>
+        <w:ind w:left="720" w:hanging="288"/>
         <w:jc w:val="left"/>
       </w:pPr>
       <w:r>
@@ -5578,7 +5618,7 @@
     <w:p>
       <w:pPr>
         <w:spacing w:line="240" w:lineRule="auto" w:after="40"/>
-        <w:ind w:left="432"/>
+        <w:ind w:left="720" w:hanging="288"/>
         <w:jc w:val="left"/>
       </w:pPr>
       <w:r>
@@ -5592,7 +5632,7 @@
     <w:p>
       <w:pPr>
         <w:spacing w:line="240" w:lineRule="auto" w:after="40"/>
-        <w:ind w:left="432"/>
+        <w:ind w:left="720" w:hanging="288"/>
         <w:jc w:val="left"/>
       </w:pPr>
       <w:r>
@@ -5606,7 +5646,7 @@
     <w:p>
       <w:pPr>
         <w:spacing w:line="240" w:lineRule="auto" w:after="40"/>
-        <w:ind w:left="432"/>
+        <w:ind w:left="720" w:hanging="288"/>
         <w:jc w:val="left"/>
       </w:pPr>
       <w:r>
@@ -5620,7 +5660,7 @@
     <w:p>
       <w:pPr>
         <w:spacing w:line="240" w:lineRule="auto" w:after="40"/>
-        <w:ind w:left="432"/>
+        <w:ind w:left="720" w:hanging="288"/>
         <w:jc w:val="left"/>
       </w:pPr>
       <w:r>
@@ -5634,7 +5674,7 @@
     <w:p>
       <w:pPr>
         <w:spacing w:line="240" w:lineRule="auto" w:after="40"/>
-        <w:ind w:left="432"/>
+        <w:ind w:left="720" w:hanging="288"/>
         <w:jc w:val="left"/>
       </w:pPr>
       <w:r>
@@ -5648,7 +5688,7 @@
     <w:p>
       <w:pPr>
         <w:spacing w:line="240" w:lineRule="auto" w:after="40"/>
-        <w:ind w:left="432"/>
+        <w:ind w:left="720" w:hanging="288"/>
         <w:jc w:val="left"/>
       </w:pPr>
       <w:r>
@@ -5662,7 +5702,7 @@
     <w:p>
       <w:pPr>
         <w:spacing w:line="240" w:lineRule="auto" w:after="40"/>
-        <w:ind w:left="432"/>
+        <w:ind w:left="720" w:hanging="288"/>
         <w:jc w:val="left"/>
       </w:pPr>
       <w:r>
@@ -5676,7 +5716,7 @@
     <w:p>
       <w:pPr>
         <w:spacing w:line="240" w:lineRule="auto" w:after="40"/>
-        <w:ind w:left="432"/>
+        <w:ind w:left="720" w:hanging="288"/>
         <w:jc w:val="left"/>
       </w:pPr>
       <w:r>
@@ -5690,7 +5730,7 @@
     <w:p>
       <w:pPr>
         <w:spacing w:line="240" w:lineRule="auto" w:after="40"/>
-        <w:ind w:left="432"/>
+        <w:ind w:left="720" w:hanging="288"/>
         <w:jc w:val="left"/>
       </w:pPr>
       <w:r>
@@ -5704,7 +5744,7 @@
     <w:p>
       <w:pPr>
         <w:spacing w:line="240" w:lineRule="auto" w:after="40"/>
-        <w:ind w:left="432"/>
+        <w:ind w:left="720" w:hanging="288"/>
         <w:jc w:val="left"/>
       </w:pPr>
       <w:r>
@@ -5733,7 +5773,7 @@
     <w:p>
       <w:pPr>
         <w:spacing w:line="240" w:lineRule="auto" w:after="40"/>
-        <w:ind w:left="432"/>
+        <w:ind w:left="720" w:hanging="288"/>
         <w:jc w:val="left"/>
       </w:pPr>
       <w:r>
@@ -5747,7 +5787,7 @@
     <w:p>
       <w:pPr>
         <w:spacing w:line="240" w:lineRule="auto" w:after="40"/>
-        <w:ind w:left="432"/>
+        <w:ind w:left="720" w:hanging="288"/>
         <w:jc w:val="left"/>
       </w:pPr>
       <w:r>
@@ -5761,7 +5801,7 @@
     <w:p>
       <w:pPr>
         <w:spacing w:line="240" w:lineRule="auto" w:after="40"/>
-        <w:ind w:left="432"/>
+        <w:ind w:left="720" w:hanging="288"/>
         <w:jc w:val="left"/>
       </w:pPr>
       <w:r>
@@ -5775,7 +5815,7 @@
     <w:p>
       <w:pPr>
         <w:spacing w:line="240" w:lineRule="auto" w:after="40"/>
-        <w:ind w:left="432"/>
+        <w:ind w:left="720" w:hanging="288"/>
         <w:jc w:val="left"/>
       </w:pPr>
       <w:r>
@@ -5789,7 +5829,7 @@
     <w:p>
       <w:pPr>
         <w:spacing w:line="240" w:lineRule="auto" w:after="40"/>
-        <w:ind w:left="432"/>
+        <w:ind w:left="720" w:hanging="288"/>
         <w:jc w:val="left"/>
       </w:pPr>
       <w:r>
@@ -5803,7 +5843,7 @@
     <w:p>
       <w:pPr>
         <w:spacing w:line="240" w:lineRule="auto" w:after="40"/>
-        <w:ind w:left="432"/>
+        <w:ind w:left="720" w:hanging="288"/>
         <w:jc w:val="left"/>
       </w:pPr>
       <w:r>
@@ -5817,7 +5857,7 @@
     <w:p>
       <w:pPr>
         <w:spacing w:line="240" w:lineRule="auto" w:after="40"/>
-        <w:ind w:left="432"/>
+        <w:ind w:left="720" w:hanging="288"/>
         <w:jc w:val="left"/>
       </w:pPr>
       <w:r>
@@ -8107,7 +8147,7 @@
     <w:p>
       <w:pPr>
         <w:spacing w:line="240" w:lineRule="auto" w:after="40"/>
-        <w:ind w:left="432"/>
+        <w:ind w:left="720" w:hanging="288"/>
         <w:jc w:val="left"/>
       </w:pPr>
       <w:r>
@@ -8121,7 +8161,7 @@
     <w:p>
       <w:pPr>
         <w:spacing w:line="240" w:lineRule="auto" w:after="40"/>
-        <w:ind w:left="432"/>
+        <w:ind w:left="720" w:hanging="288"/>
         <w:jc w:val="left"/>
       </w:pPr>
       <w:r>
@@ -8135,7 +8175,7 @@
     <w:p>
       <w:pPr>
         <w:spacing w:line="240" w:lineRule="auto" w:after="40"/>
-        <w:ind w:left="432"/>
+        <w:ind w:left="720" w:hanging="288"/>
         <w:jc w:val="left"/>
       </w:pPr>
       <w:r>
@@ -8149,7 +8189,7 @@
     <w:p>
       <w:pPr>
         <w:spacing w:line="240" w:lineRule="auto" w:after="40"/>
-        <w:ind w:left="432"/>
+        <w:ind w:left="720" w:hanging="288"/>
         <w:jc w:val="left"/>
       </w:pPr>
       <w:r>
@@ -8163,7 +8203,7 @@
     <w:p>
       <w:pPr>
         <w:spacing w:line="240" w:lineRule="auto" w:after="40"/>
-        <w:ind w:left="432"/>
+        <w:ind w:left="720" w:hanging="288"/>
         <w:jc w:val="left"/>
       </w:pPr>
       <w:r>
@@ -8192,7 +8232,7 @@
     <w:p>
       <w:pPr>
         <w:spacing w:line="240" w:lineRule="auto" w:after="40"/>
-        <w:ind w:left="432"/>
+        <w:ind w:left="720" w:hanging="288"/>
         <w:jc w:val="left"/>
       </w:pPr>
       <w:r>
@@ -8206,7 +8246,7 @@
     <w:p>
       <w:pPr>
         <w:spacing w:line="240" w:lineRule="auto" w:after="40"/>
-        <w:ind w:left="432"/>
+        <w:ind w:left="720" w:hanging="288"/>
         <w:jc w:val="left"/>
       </w:pPr>
       <w:r>
@@ -8220,7 +8260,7 @@
     <w:p>
       <w:pPr>
         <w:spacing w:line="240" w:lineRule="auto" w:after="40"/>
-        <w:ind w:left="432"/>
+        <w:ind w:left="720" w:hanging="288"/>
         <w:jc w:val="left"/>
       </w:pPr>
       <w:r>
@@ -8234,7 +8274,7 @@
     <w:p>
       <w:pPr>
         <w:spacing w:line="240" w:lineRule="auto" w:after="40"/>
-        <w:ind w:left="432"/>
+        <w:ind w:left="720" w:hanging="288"/>
         <w:jc w:val="left"/>
       </w:pPr>
       <w:r>
@@ -8248,7 +8288,7 @@
     <w:p>
       <w:pPr>
         <w:spacing w:line="240" w:lineRule="auto" w:after="40"/>
-        <w:ind w:left="432"/>
+        <w:ind w:left="720" w:hanging="288"/>
         <w:jc w:val="left"/>
       </w:pPr>
       <w:r>
@@ -8262,7 +8302,7 @@
     <w:p>
       <w:pPr>
         <w:spacing w:line="240" w:lineRule="auto" w:after="40"/>
-        <w:ind w:left="432"/>
+        <w:ind w:left="720" w:hanging="288"/>
         <w:jc w:val="left"/>
       </w:pPr>
       <w:r>
@@ -8276,7 +8316,7 @@
     <w:p>
       <w:pPr>
         <w:spacing w:line="240" w:lineRule="auto" w:after="40"/>
-        <w:ind w:left="432"/>
+        <w:ind w:left="720" w:hanging="288"/>
         <w:jc w:val="left"/>
       </w:pPr>
       <w:r>
@@ -8305,7 +8345,7 @@
     <w:p>
       <w:pPr>
         <w:spacing w:line="240" w:lineRule="auto" w:after="40"/>
-        <w:ind w:left="432"/>
+        <w:ind w:left="720" w:hanging="288"/>
         <w:jc w:val="left"/>
       </w:pPr>
       <w:r>
@@ -8319,7 +8359,7 @@
     <w:p>
       <w:pPr>
         <w:spacing w:line="240" w:lineRule="auto" w:after="40"/>
-        <w:ind w:left="432"/>
+        <w:ind w:left="720" w:hanging="288"/>
         <w:jc w:val="left"/>
       </w:pPr>
       <w:r>
@@ -8333,7 +8373,7 @@
     <w:p>
       <w:pPr>
         <w:spacing w:line="240" w:lineRule="auto" w:after="40"/>
-        <w:ind w:left="432"/>
+        <w:ind w:left="720" w:hanging="288"/>
         <w:jc w:val="left"/>
       </w:pPr>
       <w:r>
@@ -8347,7 +8387,7 @@
     <w:p>
       <w:pPr>
         <w:spacing w:line="240" w:lineRule="auto" w:after="40"/>
-        <w:ind w:left="432"/>
+        <w:ind w:left="720" w:hanging="288"/>
         <w:jc w:val="left"/>
       </w:pPr>
       <w:r>
@@ -8361,7 +8401,7 @@
     <w:p>
       <w:pPr>
         <w:spacing w:line="240" w:lineRule="auto" w:after="40"/>
-        <w:ind w:left="432"/>
+        <w:ind w:left="720" w:hanging="288"/>
         <w:jc w:val="left"/>
       </w:pPr>
       <w:r>
@@ -8390,7 +8430,7 @@
     <w:p>
       <w:pPr>
         <w:spacing w:line="240" w:lineRule="auto" w:after="40"/>
-        <w:ind w:left="432"/>
+        <w:ind w:left="720" w:hanging="288"/>
         <w:jc w:val="left"/>
       </w:pPr>
       <w:r>
@@ -8404,7 +8444,7 @@
     <w:p>
       <w:pPr>
         <w:spacing w:line="240" w:lineRule="auto" w:after="40"/>
-        <w:ind w:left="432"/>
+        <w:ind w:left="720" w:hanging="288"/>
         <w:jc w:val="left"/>
       </w:pPr>
       <w:r>
@@ -8418,7 +8458,7 @@
     <w:p>
       <w:pPr>
         <w:spacing w:line="240" w:lineRule="auto" w:after="40"/>
-        <w:ind w:left="432"/>
+        <w:ind w:left="720" w:hanging="288"/>
         <w:jc w:val="left"/>
       </w:pPr>
       <w:r>
@@ -8432,7 +8472,7 @@
     <w:p>
       <w:pPr>
         <w:spacing w:line="240" w:lineRule="auto" w:after="40"/>
-        <w:ind w:left="432"/>
+        <w:ind w:left="720" w:hanging="288"/>
         <w:jc w:val="left"/>
       </w:pPr>
       <w:r>
@@ -8461,7 +8501,7 @@
     <w:p>
       <w:pPr>
         <w:spacing w:line="240" w:lineRule="auto" w:after="40"/>
-        <w:ind w:left="432"/>
+        <w:ind w:left="720" w:hanging="288"/>
         <w:jc w:val="left"/>
       </w:pPr>
       <w:r>
@@ -8475,7 +8515,7 @@
     <w:p>
       <w:pPr>
         <w:spacing w:line="240" w:lineRule="auto" w:after="40"/>
-        <w:ind w:left="432"/>
+        <w:ind w:left="720" w:hanging="288"/>
         <w:jc w:val="left"/>
       </w:pPr>
       <w:r>
@@ -8489,7 +8529,7 @@
     <w:p>
       <w:pPr>
         <w:spacing w:line="240" w:lineRule="auto" w:after="40"/>
-        <w:ind w:left="432"/>
+        <w:ind w:left="720" w:hanging="288"/>
         <w:jc w:val="left"/>
       </w:pPr>
       <w:r>
@@ -8498,6 +8538,46 @@
           <w:sz w:val="24"/>
         </w:rPr>
         <w:t>• DispatcherService — domain service responsible for picking an available agent for a given region.</w:t>
+      </w:r>
+    </w:p>
+    <w:p>
+      <w:pPr>
+        <w:spacing w:before="120" w:after="40"/>
+        <w:jc w:val="center"/>
+      </w:pPr>
+      <w:r>
+        <w:drawing>
+          <wp:inline>
+            <wp:extent cx="5394960" cy="3774631"/>
+            <wp:docPr id="4" name="Picture 4"/>
+            <wp:cNvGraphicFramePr>
+              <a:graphicFrameLocks noChangeAspect="1"/>
+            </wp:cNvGraphicFramePr>
+            <a:graphic>
+              <a:graphicData uri="http://schemas.openxmlformats.org/drawingml/2006/picture">
+                <pic:pic>
+                  <pic:nvPicPr>
+                    <pic:cNvPr id="0" name="fig_2_1_restaurant_classes.png"/>
+                    <pic:cNvPicPr/>
+                  </pic:nvPicPr>
+                  <pic:blipFill>
+                    <a:blip r:embed="rId14"/>
+                    <a:stretch>
+                      <a:fillRect/>
+                    </a:stretch>
+                  </pic:blipFill>
+                  <pic:spPr>
+                    <a:xfrm>
+                      <a:off x="0" y="0"/>
+                      <a:ext cx="5394960" cy="3774631"/>
+                    </a:xfrm>
+                    <a:prstGeom prst="rect"/>
+                  </pic:spPr>
+                </pic:pic>
+              </a:graphicData>
+            </a:graphic>
+          </wp:inline>
+        </w:drawing>
       </w:r>
     </w:p>
     <w:p>
@@ -8516,6 +8596,46 @@
     </w:p>
     <w:p>
       <w:pPr>
+        <w:spacing w:before="120" w:after="40"/>
+        <w:jc w:val="center"/>
+      </w:pPr>
+      <w:r>
+        <w:drawing>
+          <wp:inline>
+            <wp:extent cx="5577840" cy="2213251"/>
+            <wp:docPr id="5" name="Picture 5"/>
+            <wp:cNvGraphicFramePr>
+              <a:graphicFrameLocks noChangeAspect="1"/>
+            </wp:cNvGraphicFramePr>
+            <a:graphic>
+              <a:graphicData uri="http://schemas.openxmlformats.org/drawingml/2006/picture">
+                <pic:pic>
+                  <pic:nvPicPr>
+                    <pic:cNvPr id="0" name="fig_2_2_order_states.png"/>
+                    <pic:cNvPicPr/>
+                  </pic:nvPicPr>
+                  <pic:blipFill>
+                    <a:blip r:embed="rId15"/>
+                    <a:stretch>
+                      <a:fillRect/>
+                    </a:stretch>
+                  </pic:blipFill>
+                  <pic:spPr>
+                    <a:xfrm>
+                      <a:off x="0" y="0"/>
+                      <a:ext cx="5577840" cy="2213251"/>
+                    </a:xfrm>
+                    <a:prstGeom prst="rect"/>
+                  </pic:spPr>
+                </pic:pic>
+              </a:graphicData>
+            </a:graphic>
+          </wp:inline>
+        </w:drawing>
+      </w:r>
+    </w:p>
+    <w:p>
+      <w:pPr>
         <w:spacing w:line="240" w:lineRule="auto" w:after="240"/>
         <w:jc w:val="center"/>
       </w:pPr>
@@ -8587,7 +8707,7 @@
     <w:p>
       <w:pPr>
         <w:spacing w:line="240" w:lineRule="auto" w:after="40"/>
-        <w:ind w:left="432"/>
+        <w:ind w:left="720" w:hanging="288"/>
         <w:jc w:val="left"/>
       </w:pPr>
       <w:r>
@@ -8601,7 +8721,7 @@
     <w:p>
       <w:pPr>
         <w:spacing w:line="240" w:lineRule="auto" w:after="40"/>
-        <w:ind w:left="432"/>
+        <w:ind w:left="720" w:hanging="288"/>
         <w:jc w:val="left"/>
       </w:pPr>
       <w:r>
@@ -8615,7 +8735,7 @@
     <w:p>
       <w:pPr>
         <w:spacing w:line="240" w:lineRule="auto" w:after="40"/>
-        <w:ind w:left="432"/>
+        <w:ind w:left="720" w:hanging="288"/>
         <w:jc w:val="left"/>
       </w:pPr>
       <w:r>
@@ -8642,7 +8762,7 @@
     <w:p>
       <w:pPr>
         <w:spacing w:line="240" w:lineRule="auto" w:after="40"/>
-        <w:ind w:left="432"/>
+        <w:ind w:left="720" w:hanging="288"/>
         <w:jc w:val="left"/>
       </w:pPr>
       <w:r>
@@ -8656,7 +8776,7 @@
     <w:p>
       <w:pPr>
         <w:spacing w:line="240" w:lineRule="auto" w:after="40"/>
-        <w:ind w:left="432"/>
+        <w:ind w:left="720" w:hanging="288"/>
         <w:jc w:val="left"/>
       </w:pPr>
       <w:r>
@@ -8711,7 +8831,7 @@
     <w:p>
       <w:pPr>
         <w:spacing w:line="240" w:lineRule="auto" w:after="40"/>
-        <w:ind w:left="432"/>
+        <w:ind w:left="720" w:hanging="288"/>
         <w:jc w:val="left"/>
       </w:pPr>
       <w:r>
@@ -8725,7 +8845,7 @@
     <w:p>
       <w:pPr>
         <w:spacing w:line="240" w:lineRule="auto" w:after="40"/>
-        <w:ind w:left="432"/>
+        <w:ind w:left="720" w:hanging="288"/>
         <w:jc w:val="left"/>
       </w:pPr>
       <w:r>
@@ -8739,7 +8859,7 @@
     <w:p>
       <w:pPr>
         <w:spacing w:line="240" w:lineRule="auto" w:after="40"/>
-        <w:ind w:left="432"/>
+        <w:ind w:left="720" w:hanging="288"/>
         <w:jc w:val="left"/>
       </w:pPr>
       <w:r>
@@ -8753,7 +8873,7 @@
     <w:p>
       <w:pPr>
         <w:spacing w:line="240" w:lineRule="auto" w:after="40"/>
-        <w:ind w:left="432"/>
+        <w:ind w:left="720" w:hanging="288"/>
         <w:jc w:val="left"/>
       </w:pPr>
       <w:r>
@@ -8767,7 +8887,7 @@
     <w:p>
       <w:pPr>
         <w:spacing w:line="240" w:lineRule="auto" w:after="40"/>
-        <w:ind w:left="432"/>
+        <w:ind w:left="720" w:hanging="288"/>
         <w:jc w:val="left"/>
       </w:pPr>
       <w:r>
@@ -8794,7 +8914,7 @@
     <w:p>
       <w:pPr>
         <w:spacing w:line="240" w:lineRule="auto" w:after="40"/>
-        <w:ind w:left="432"/>
+        <w:ind w:left="720" w:hanging="288"/>
         <w:jc w:val="left"/>
       </w:pPr>
       <w:r>
@@ -8808,7 +8928,7 @@
     <w:p>
       <w:pPr>
         <w:spacing w:line="240" w:lineRule="auto" w:after="40"/>
-        <w:ind w:left="432"/>
+        <w:ind w:left="720" w:hanging="288"/>
         <w:jc w:val="left"/>
       </w:pPr>
       <w:r>
@@ -8876,7 +8996,7 @@
     <w:p>
       <w:pPr>
         <w:spacing w:line="240" w:lineRule="auto" w:after="40"/>
-        <w:ind w:left="432"/>
+        <w:ind w:left="720" w:hanging="288"/>
         <w:jc w:val="left"/>
       </w:pPr>
       <w:r>
@@ -8890,7 +9010,7 @@
     <w:p>
       <w:pPr>
         <w:spacing w:line="240" w:lineRule="auto" w:after="40"/>
-        <w:ind w:left="432"/>
+        <w:ind w:left="720" w:hanging="288"/>
         <w:jc w:val="left"/>
       </w:pPr>
       <w:r>
@@ -8904,7 +9024,7 @@
     <w:p>
       <w:pPr>
         <w:spacing w:line="240" w:lineRule="auto" w:after="40"/>
-        <w:ind w:left="432"/>
+        <w:ind w:left="720" w:hanging="288"/>
         <w:jc w:val="left"/>
       </w:pPr>
       <w:r>
@@ -8918,7 +9038,7 @@
     <w:p>
       <w:pPr>
         <w:spacing w:line="240" w:lineRule="auto" w:after="40"/>
-        <w:ind w:left="432"/>
+        <w:ind w:left="720" w:hanging="288"/>
         <w:jc w:val="left"/>
       </w:pPr>
       <w:r>
@@ -8945,7 +9065,7 @@
     <w:p>
       <w:pPr>
         <w:spacing w:line="240" w:lineRule="auto" w:after="40"/>
-        <w:ind w:left="432"/>
+        <w:ind w:left="720" w:hanging="288"/>
         <w:jc w:val="left"/>
       </w:pPr>
       <w:r>
@@ -8959,7 +9079,7 @@
     <w:p>
       <w:pPr>
         <w:spacing w:line="240" w:lineRule="auto" w:after="40"/>
-        <w:ind w:left="432"/>
+        <w:ind w:left="720" w:hanging="288"/>
         <w:jc w:val="left"/>
       </w:pPr>
       <w:r>
@@ -9014,7 +9134,7 @@
     <w:p>
       <w:pPr>
         <w:spacing w:line="240" w:lineRule="auto" w:after="40"/>
-        <w:ind w:left="432"/>
+        <w:ind w:left="720" w:hanging="288"/>
         <w:jc w:val="left"/>
       </w:pPr>
       <w:r>
@@ -9028,7 +9148,7 @@
     <w:p>
       <w:pPr>
         <w:spacing w:line="240" w:lineRule="auto" w:after="40"/>
-        <w:ind w:left="432"/>
+        <w:ind w:left="720" w:hanging="288"/>
         <w:jc w:val="left"/>
       </w:pPr>
       <w:r>
@@ -9096,7 +9216,7 @@
     <w:p>
       <w:pPr>
         <w:spacing w:line="240" w:lineRule="auto" w:after="40"/>
-        <w:ind w:left="432"/>
+        <w:ind w:left="720" w:hanging="288"/>
         <w:jc w:val="left"/>
       </w:pPr>
       <w:r>
@@ -9110,7 +9230,7 @@
     <w:p>
       <w:pPr>
         <w:spacing w:line="240" w:lineRule="auto" w:after="40"/>
-        <w:ind w:left="432"/>
+        <w:ind w:left="720" w:hanging="288"/>
         <w:jc w:val="left"/>
       </w:pPr>
       <w:r>
@@ -9149,6 +9269,46 @@
     </w:p>
     <w:p>
       <w:pPr>
+        <w:spacing w:before="120" w:after="40"/>
+        <w:jc w:val="center"/>
+      </w:pPr>
+      <w:r>
+        <w:drawing>
+          <wp:inline>
+            <wp:extent cx="5577840" cy="3934669"/>
+            <wp:docPr id="6" name="Picture 6"/>
+            <wp:cNvGraphicFramePr>
+              <a:graphicFrameLocks noChangeAspect="1"/>
+            </wp:cNvGraphicFramePr>
+            <a:graphic>
+              <a:graphicData uri="http://schemas.openxmlformats.org/drawingml/2006/picture">
+                <pic:pic>
+                  <pic:nvPicPr>
+                    <pic:cNvPr id="0" name="fig_3_1_er.png"/>
+                    <pic:cNvPicPr/>
+                  </pic:nvPicPr>
+                  <pic:blipFill>
+                    <a:blip r:embed="rId16"/>
+                    <a:stretch>
+                      <a:fillRect/>
+                    </a:stretch>
+                  </pic:blipFill>
+                  <pic:spPr>
+                    <a:xfrm>
+                      <a:off x="0" y="0"/>
+                      <a:ext cx="5577840" cy="3934669"/>
+                    </a:xfrm>
+                    <a:prstGeom prst="rect"/>
+                  </pic:spPr>
+                </pic:pic>
+              </a:graphicData>
+            </a:graphic>
+          </wp:inline>
+        </w:drawing>
+      </w:r>
+    </w:p>
+    <w:p>
+      <w:pPr>
         <w:spacing w:line="240" w:lineRule="auto" w:after="240"/>
         <w:jc w:val="center"/>
       </w:pPr>
@@ -9207,7 +9367,7 @@
     <w:p>
       <w:pPr>
         <w:spacing w:line="240" w:lineRule="auto" w:after="40"/>
-        <w:ind w:left="432"/>
+        <w:ind w:left="720" w:hanging="288"/>
         <w:jc w:val="left"/>
       </w:pPr>
       <w:r>
@@ -9221,7 +9381,7 @@
     <w:p>
       <w:pPr>
         <w:spacing w:line="240" w:lineRule="auto" w:after="40"/>
-        <w:ind w:left="432"/>
+        <w:ind w:left="720" w:hanging="288"/>
         <w:jc w:val="left"/>
       </w:pPr>
       <w:r>
@@ -9235,7 +9395,7 @@
     <w:p>
       <w:pPr>
         <w:spacing w:line="240" w:lineRule="auto" w:after="40"/>
-        <w:ind w:left="432"/>
+        <w:ind w:left="720" w:hanging="288"/>
         <w:jc w:val="left"/>
       </w:pPr>
       <w:r>
@@ -9249,7 +9409,7 @@
     <w:p>
       <w:pPr>
         <w:spacing w:line="240" w:lineRule="auto" w:after="40"/>
-        <w:ind w:left="432"/>
+        <w:ind w:left="720" w:hanging="288"/>
         <w:jc w:val="left"/>
       </w:pPr>
       <w:r>
@@ -9263,7 +9423,7 @@
     <w:p>
       <w:pPr>
         <w:spacing w:line="240" w:lineRule="auto" w:after="40"/>
-        <w:ind w:left="432"/>
+        <w:ind w:left="720" w:hanging="288"/>
         <w:jc w:val="left"/>
       </w:pPr>
       <w:r>
@@ -9333,7 +9493,7 @@
     <w:p>
       <w:pPr>
         <w:spacing w:line="240" w:lineRule="auto" w:after="40"/>
-        <w:ind w:left="432"/>
+        <w:ind w:left="720" w:hanging="288"/>
         <w:jc w:val="left"/>
       </w:pPr>
       <w:r>
@@ -9347,7 +9507,7 @@
     <w:p>
       <w:pPr>
         <w:spacing w:line="240" w:lineRule="auto" w:after="40"/>
-        <w:ind w:left="432"/>
+        <w:ind w:left="720" w:hanging="288"/>
         <w:jc w:val="left"/>
       </w:pPr>
       <w:r>
@@ -9361,7 +9521,7 @@
     <w:p>
       <w:pPr>
         <w:spacing w:line="240" w:lineRule="auto" w:after="40"/>
-        <w:ind w:left="432"/>
+        <w:ind w:left="720" w:hanging="288"/>
         <w:jc w:val="left"/>
       </w:pPr>
       <w:r>
@@ -9954,7 +10114,7 @@
     <w:p>
       <w:pPr>
         <w:spacing w:line="240" w:lineRule="auto" w:after="40"/>
-        <w:ind w:left="432"/>
+        <w:ind w:left="720" w:hanging="288"/>
         <w:jc w:val="left"/>
       </w:pPr>
       <w:r>
@@ -9968,7 +10128,7 @@
     <w:p>
       <w:pPr>
         <w:spacing w:line="240" w:lineRule="auto" w:after="40"/>
-        <w:ind w:left="432"/>
+        <w:ind w:left="720" w:hanging="288"/>
         <w:jc w:val="left"/>
       </w:pPr>
       <w:r>
@@ -9982,7 +10142,7 @@
     <w:p>
       <w:pPr>
         <w:spacing w:line="240" w:lineRule="auto" w:after="40"/>
-        <w:ind w:left="432"/>
+        <w:ind w:left="720" w:hanging="288"/>
         <w:jc w:val="left"/>
       </w:pPr>
       <w:r>
@@ -9996,7 +10156,7 @@
     <w:p>
       <w:pPr>
         <w:spacing w:line="240" w:lineRule="auto" w:after="40"/>
-        <w:ind w:left="432"/>
+        <w:ind w:left="720" w:hanging="288"/>
         <w:jc w:val="left"/>
       </w:pPr>
       <w:r>
@@ -10053,7 +10213,7 @@
     <w:p>
       <w:pPr>
         <w:spacing w:line="240" w:lineRule="auto" w:after="40"/>
-        <w:ind w:left="432"/>
+        <w:ind w:left="720" w:hanging="288"/>
         <w:jc w:val="left"/>
       </w:pPr>
       <w:r>
@@ -10067,7 +10227,7 @@
     <w:p>
       <w:pPr>
         <w:spacing w:line="240" w:lineRule="auto" w:after="40"/>
-        <w:ind w:left="432"/>
+        <w:ind w:left="720" w:hanging="288"/>
         <w:jc w:val="left"/>
       </w:pPr>
       <w:r>
@@ -10081,7 +10241,7 @@
     <w:p>
       <w:pPr>
         <w:spacing w:line="240" w:lineRule="auto" w:after="40"/>
-        <w:ind w:left="432"/>
+        <w:ind w:left="720" w:hanging="288"/>
         <w:jc w:val="left"/>
       </w:pPr>
       <w:r>
@@ -10110,7 +10270,7 @@
     <w:p>
       <w:pPr>
         <w:spacing w:line="240" w:lineRule="auto" w:after="40"/>
-        <w:ind w:left="432"/>
+        <w:ind w:left="720" w:hanging="288"/>
         <w:jc w:val="left"/>
       </w:pPr>
       <w:r>
@@ -10124,7 +10284,7 @@
     <w:p>
       <w:pPr>
         <w:spacing w:line="240" w:lineRule="auto" w:after="40"/>
-        <w:ind w:left="432"/>
+        <w:ind w:left="720" w:hanging="288"/>
         <w:jc w:val="left"/>
       </w:pPr>
       <w:r>
@@ -10138,7 +10298,7 @@
     <w:p>
       <w:pPr>
         <w:spacing w:line="240" w:lineRule="auto" w:after="40"/>
-        <w:ind w:left="432"/>
+        <w:ind w:left="720" w:hanging="288"/>
         <w:jc w:val="left"/>
       </w:pPr>
       <w:r>
@@ -10167,7 +10327,7 @@
     <w:p>
       <w:pPr>
         <w:spacing w:line="240" w:lineRule="auto" w:after="40"/>
-        <w:ind w:left="432"/>
+        <w:ind w:left="720" w:hanging="288"/>
         <w:jc w:val="left"/>
       </w:pPr>
       <w:r>
@@ -10181,7 +10341,7 @@
     <w:p>
       <w:pPr>
         <w:spacing w:line="240" w:lineRule="auto" w:after="40"/>
-        <w:ind w:left="432"/>
+        <w:ind w:left="720" w:hanging="288"/>
         <w:jc w:val="left"/>
       </w:pPr>
       <w:r>
@@ -10195,7 +10355,7 @@
     <w:p>
       <w:pPr>
         <w:spacing w:line="240" w:lineRule="auto" w:after="40"/>
-        <w:ind w:left="432"/>
+        <w:ind w:left="720" w:hanging="288"/>
         <w:jc w:val="left"/>
       </w:pPr>
       <w:r>
@@ -10209,7 +10369,7 @@
     <w:p>
       <w:pPr>
         <w:spacing w:line="240" w:lineRule="auto" w:after="40"/>
-        <w:ind w:left="432"/>
+        <w:ind w:left="720" w:hanging="288"/>
         <w:jc w:val="left"/>
       </w:pPr>
       <w:r>
@@ -10223,7 +10383,7 @@
     <w:p>
       <w:pPr>
         <w:spacing w:line="240" w:lineRule="auto" w:after="40"/>
-        <w:ind w:left="432"/>
+        <w:ind w:left="720" w:hanging="288"/>
         <w:jc w:val="left"/>
       </w:pPr>
       <w:r>
@@ -10264,6 +10424,46 @@
     </w:p>
     <w:p>
       <w:pPr>
+        <w:spacing w:before="120" w:after="40"/>
+        <w:jc w:val="center"/>
+      </w:pPr>
+      <w:r>
+        <w:drawing>
+          <wp:inline>
+            <wp:extent cx="5577840" cy="3670333"/>
+            <wp:docPr id="7" name="Picture 7"/>
+            <wp:cNvGraphicFramePr>
+              <a:graphicFrameLocks noChangeAspect="1"/>
+            </wp:cNvGraphicFramePr>
+            <a:graphic>
+              <a:graphicData uri="http://schemas.openxmlformats.org/drawingml/2006/picture">
+                <pic:pic>
+                  <pic:nvPicPr>
+                    <pic:cNvPr id="0" name="fig_5_1_deployment.png"/>
+                    <pic:cNvPicPr/>
+                  </pic:nvPicPr>
+                  <pic:blipFill>
+                    <a:blip r:embed="rId17"/>
+                    <a:stretch>
+                      <a:fillRect/>
+                    </a:stretch>
+                  </pic:blipFill>
+                  <pic:spPr>
+                    <a:xfrm>
+                      <a:off x="0" y="0"/>
+                      <a:ext cx="5577840" cy="3670333"/>
+                    </a:xfrm>
+                    <a:prstGeom prst="rect"/>
+                  </pic:spPr>
+                </pic:pic>
+              </a:graphicData>
+            </a:graphic>
+          </wp:inline>
+        </w:drawing>
+      </w:r>
+    </w:p>
+    <w:p>
+      <w:pPr>
         <w:spacing w:line="240" w:lineRule="auto" w:after="240"/>
         <w:jc w:val="center"/>
       </w:pPr>
@@ -10587,7 +10787,7 @@
     <w:p>
       <w:pPr>
         <w:spacing w:line="240" w:lineRule="auto" w:after="40"/>
-        <w:ind w:left="432"/>
+        <w:ind w:left="720" w:hanging="288"/>
         <w:jc w:val="left"/>
       </w:pPr>
       <w:r>
@@ -10601,7 +10801,7 @@
     <w:p>
       <w:pPr>
         <w:spacing w:line="240" w:lineRule="auto" w:after="40"/>
-        <w:ind w:left="432"/>
+        <w:ind w:left="720" w:hanging="288"/>
         <w:jc w:val="left"/>
       </w:pPr>
       <w:r>
@@ -10615,7 +10815,7 @@
     <w:p>
       <w:pPr>
         <w:spacing w:line="240" w:lineRule="auto" w:after="40"/>
-        <w:ind w:left="432"/>
+        <w:ind w:left="720" w:hanging="288"/>
         <w:jc w:val="left"/>
       </w:pPr>
       <w:r>
@@ -10629,7 +10829,7 @@
     <w:p>
       <w:pPr>
         <w:spacing w:line="240" w:lineRule="auto" w:after="40"/>
-        <w:ind w:left="432"/>
+        <w:ind w:left="720" w:hanging="288"/>
         <w:jc w:val="left"/>
       </w:pPr>
       <w:r>
@@ -10643,7 +10843,7 @@
     <w:p>
       <w:pPr>
         <w:spacing w:line="240" w:lineRule="auto" w:after="40"/>
-        <w:ind w:left="432"/>
+        <w:ind w:left="720" w:hanging="288"/>
         <w:jc w:val="left"/>
       </w:pPr>
       <w:r>
@@ -10657,7 +10857,7 @@
     <w:p>
       <w:pPr>
         <w:spacing w:line="240" w:lineRule="auto" w:after="40"/>
-        <w:ind w:left="432"/>
+        <w:ind w:left="720" w:hanging="288"/>
         <w:jc w:val="left"/>
       </w:pPr>
       <w:r>
@@ -10671,7 +10871,7 @@
     <w:p>
       <w:pPr>
         <w:spacing w:line="240" w:lineRule="auto" w:after="40"/>
-        <w:ind w:left="432"/>
+        <w:ind w:left="720" w:hanging="288"/>
         <w:jc w:val="left"/>
       </w:pPr>
       <w:r>
@@ -10728,7 +10928,7 @@
     <w:p>
       <w:pPr>
         <w:spacing w:line="240" w:lineRule="auto" w:after="40"/>
-        <w:ind w:left="432"/>
+        <w:ind w:left="720" w:hanging="288"/>
         <w:jc w:val="left"/>
       </w:pPr>
       <w:r>
@@ -10742,7 +10942,7 @@
     <w:p>
       <w:pPr>
         <w:spacing w:line="240" w:lineRule="auto" w:after="40"/>
-        <w:ind w:left="432"/>
+        <w:ind w:left="720" w:hanging="288"/>
         <w:jc w:val="left"/>
       </w:pPr>
       <w:r>
@@ -10756,7 +10956,7 @@
     <w:p>
       <w:pPr>
         <w:spacing w:line="240" w:lineRule="auto" w:after="40"/>
-        <w:ind w:left="432"/>
+        <w:ind w:left="720" w:hanging="288"/>
         <w:jc w:val="left"/>
       </w:pPr>
       <w:r>
@@ -10770,7 +10970,7 @@
     <w:p>
       <w:pPr>
         <w:spacing w:line="240" w:lineRule="auto" w:after="40"/>
-        <w:ind w:left="432"/>
+        <w:ind w:left="720" w:hanging="288"/>
         <w:jc w:val="left"/>
       </w:pPr>
       <w:r>
@@ -10784,7 +10984,7 @@
     <w:p>
       <w:pPr>
         <w:spacing w:line="240" w:lineRule="auto" w:after="40"/>
-        <w:ind w:left="432"/>
+        <w:ind w:left="720" w:hanging="288"/>
         <w:jc w:val="left"/>
       </w:pPr>
       <w:r>
@@ -10798,7 +10998,7 @@
     <w:p>
       <w:pPr>
         <w:spacing w:line="240" w:lineRule="auto" w:after="40"/>
-        <w:ind w:left="432"/>
+        <w:ind w:left="720" w:hanging="288"/>
         <w:jc w:val="left"/>
       </w:pPr>
       <w:r>
@@ -12739,7 +12939,7 @@
   <w:docDefaults>
     <w:rPrDefault>
       <w:rPr>
-        <w:rFonts w:ascii="Arial" w:cs="Arial" w:eastAsia="Arial" w:hAnsi="Arial"/>
+        <w:rFonts w:ascii="Times New Roman" w:cs="Times New Roman" w:eastAsia="Times New Roman" w:hAnsi="Times New Roman"/>
         <w:sz w:val="22"/>
         <w:szCs w:val="22"/>
         <w:lang w:val="en"/>
@@ -12764,6 +12964,9 @@
   </w:style>
   <w:style w:type="paragraph" w:styleId="Normal" w:default="1">
     <w:name w:val="normal"/>
+    <w:rPr>
+      <w:rFonts w:ascii="Times New Roman" w:hAnsi="Times New Roman" w:cs="Times New Roman" w:eastAsia="Times New Roman"/>
+    </w:rPr>
   </w:style>
   <w:style w:type="paragraph" w:styleId="Heading1">
     <w:name w:val="heading 1"/>
@@ -12776,6 +12979,7 @@
       <w:spacing w:after="120" w:before="400" w:lineRule="auto"/>
     </w:pPr>
     <w:rPr>
+      <w:rFonts w:ascii="Times New Roman" w:hAnsi="Times New Roman" w:cs="Times New Roman" w:eastAsia="Times New Roman"/>
       <w:sz w:val="40"/>
       <w:szCs w:val="40"/>
     </w:rPr>
@@ -12791,6 +12995,7 @@
       <w:spacing w:after="120" w:before="360" w:lineRule="auto"/>
     </w:pPr>
     <w:rPr>
+      <w:rFonts w:ascii="Times New Roman" w:hAnsi="Times New Roman" w:cs="Times New Roman" w:eastAsia="Times New Roman"/>
       <w:b w:val="0"/>
       <w:bCs w:val="0"/>
       <w:sz w:val="32"/>
@@ -12808,6 +13013,7 @@
       <w:spacing w:after="80" w:before="320" w:lineRule="auto"/>
     </w:pPr>
     <w:rPr>
+      <w:rFonts w:ascii="Times New Roman" w:hAnsi="Times New Roman" w:cs="Times New Roman" w:eastAsia="Times New Roman"/>
       <w:b w:val="0"/>
       <w:bCs w:val="0"/>
       <w:color w:val="434343"/>
@@ -12826,6 +13032,7 @@
       <w:spacing w:after="80" w:before="280" w:lineRule="auto"/>
     </w:pPr>
     <w:rPr>
+      <w:rFonts w:ascii="Times New Roman" w:hAnsi="Times New Roman" w:cs="Times New Roman" w:eastAsia="Times New Roman"/>
       <w:color w:val="666666"/>
       <w:sz w:val="24"/>
       <w:szCs w:val="24"/>
@@ -12842,6 +13049,7 @@
       <w:spacing w:after="80" w:before="240" w:lineRule="auto"/>
     </w:pPr>
     <w:rPr>
+      <w:rFonts w:ascii="Times New Roman" w:hAnsi="Times New Roman" w:cs="Times New Roman" w:eastAsia="Times New Roman"/>
       <w:color w:val="666666"/>
       <w:sz w:val="22"/>
       <w:szCs w:val="22"/>
@@ -12858,6 +13066,7 @@
       <w:spacing w:after="80" w:before="240" w:lineRule="auto"/>
     </w:pPr>
     <w:rPr>
+      <w:rFonts w:ascii="Times New Roman" w:hAnsi="Times New Roman" w:cs="Times New Roman" w:eastAsia="Times New Roman"/>
       <w:i w:val="1"/>
       <w:iCs w:val="1"/>
       <w:color w:val="666666"/>
@@ -12876,6 +13085,7 @@
       <w:spacing w:after="60" w:before="0" w:lineRule="auto"/>
     </w:pPr>
     <w:rPr>
+      <w:rFonts w:ascii="Times New Roman" w:hAnsi="Times New Roman" w:cs="Times New Roman" w:eastAsia="Times New Roman"/>
       <w:sz w:val="52"/>
       <w:szCs w:val="52"/>
     </w:rPr>

</xml_diff>